<commit_message>
scdtype1 and scdtype2 dataflows has added
</commit_message>
<xml_diff>
--- a/Steps Screenshots/scdtype2_product.docx
+++ b/Steps Screenshots/scdtype2_product.docx
@@ -4,6 +4,9 @@
   <w:body>
     <w:p>
       <w:r>
+        <w:rPr>
+          <w:noProof/>
+        </w:rPr>
         <w:drawing>
           <wp:inline distT="0" distB="0" distL="0" distR="0" wp14:anchorId="4078E8BE" wp14:editId="34BFC7FE">
             <wp:extent cx="5731510" cy="897890"/>
@@ -43,6 +46,9 @@
     </w:p>
     <w:p>
       <w:r>
+        <w:rPr>
+          <w:noProof/>
+        </w:rPr>
         <w:drawing>
           <wp:inline distT="0" distB="0" distL="0" distR="0" wp14:anchorId="616AAC23" wp14:editId="17C24077">
             <wp:extent cx="5731510" cy="2710815"/>
@@ -82,6 +88,9 @@
     </w:p>
     <w:p>
       <w:r>
+        <w:rPr>
+          <w:noProof/>
+        </w:rPr>
         <w:drawing>
           <wp:inline distT="0" distB="0" distL="0" distR="0" wp14:anchorId="78A99AFD" wp14:editId="6EDB899D">
             <wp:extent cx="5731510" cy="2393315"/>
@@ -121,6 +130,9 @@
     </w:p>
     <w:p>
       <w:r>
+        <w:rPr>
+          <w:noProof/>
+        </w:rPr>
         <w:lastRenderedPageBreak/>
         <w:drawing>
           <wp:inline distT="0" distB="0" distL="0" distR="0" wp14:anchorId="776670BB" wp14:editId="74FD71B3">
@@ -161,6 +173,9 @@
     </w:p>
     <w:p>
       <w:r>
+        <w:rPr>
+          <w:noProof/>
+        </w:rPr>
         <w:drawing>
           <wp:inline distT="0" distB="0" distL="0" distR="0" wp14:anchorId="523C96CD" wp14:editId="5F9D8B68">
             <wp:extent cx="5731510" cy="2430145"/>
@@ -200,6 +215,9 @@
     </w:p>
     <w:p>
       <w:r>
+        <w:rPr>
+          <w:noProof/>
+        </w:rPr>
         <w:drawing>
           <wp:inline distT="0" distB="0" distL="0" distR="0" wp14:anchorId="0A4E996A" wp14:editId="5DCF98D6">
             <wp:extent cx="5731510" cy="3481705"/>
@@ -237,6 +255,524 @@
         </w:drawing>
       </w:r>
     </w:p>
+    <w:p>
+      <w:r>
+        <w:lastRenderedPageBreak/>
+        <w:drawing>
+          <wp:inline distT="0" distB="0" distL="0" distR="0" wp14:anchorId="384FB39F" wp14:editId="5728AB26">
+            <wp:extent cx="5731510" cy="2694305"/>
+            <wp:effectExtent l="0" t="0" r="2540" b="0"/>
+            <wp:docPr id="59148713" name="Picture 1"/>
+            <wp:cNvGraphicFramePr>
+              <a:graphicFrameLocks xmlns:a="http://schemas.openxmlformats.org/drawingml/2006/main" noChangeAspect="1"/>
+            </wp:cNvGraphicFramePr>
+            <a:graphic xmlns:a="http://schemas.openxmlformats.org/drawingml/2006/main">
+              <a:graphicData uri="http://schemas.openxmlformats.org/drawingml/2006/picture">
+                <pic:pic xmlns:pic="http://schemas.openxmlformats.org/drawingml/2006/picture">
+                  <pic:nvPicPr>
+                    <pic:cNvPr id="59148713" name=""/>
+                    <pic:cNvPicPr/>
+                  </pic:nvPicPr>
+                  <pic:blipFill>
+                    <a:blip r:embed="rId10"/>
+                    <a:stretch>
+                      <a:fillRect/>
+                    </a:stretch>
+                  </pic:blipFill>
+                  <pic:spPr>
+                    <a:xfrm>
+                      <a:off x="0" y="0"/>
+                      <a:ext cx="5731510" cy="2694305"/>
+                    </a:xfrm>
+                    <a:prstGeom prst="rect">
+                      <a:avLst/>
+                    </a:prstGeom>
+                  </pic:spPr>
+                </pic:pic>
+              </a:graphicData>
+            </a:graphic>
+          </wp:inline>
+        </w:drawing>
+      </w:r>
+    </w:p>
+    <w:p>
+      <w:r>
+        <w:t>Update previous record as inactive if we have updated record and add new record with updated values with active status.</w:t>
+      </w:r>
+    </w:p>
+    <w:p>
+      <w:r>
+        <w:drawing>
+          <wp:inline distT="0" distB="0" distL="0" distR="0" wp14:anchorId="6E514B50" wp14:editId="5D11F41A">
+            <wp:extent cx="5731510" cy="2844165"/>
+            <wp:effectExtent l="0" t="0" r="2540" b="0"/>
+            <wp:docPr id="316962075" name="Picture 1"/>
+            <wp:cNvGraphicFramePr>
+              <a:graphicFrameLocks xmlns:a="http://schemas.openxmlformats.org/drawingml/2006/main" noChangeAspect="1"/>
+            </wp:cNvGraphicFramePr>
+            <a:graphic xmlns:a="http://schemas.openxmlformats.org/drawingml/2006/main">
+              <a:graphicData uri="http://schemas.openxmlformats.org/drawingml/2006/picture">
+                <pic:pic xmlns:pic="http://schemas.openxmlformats.org/drawingml/2006/picture">
+                  <pic:nvPicPr>
+                    <pic:cNvPr id="316962075" name=""/>
+                    <pic:cNvPicPr/>
+                  </pic:nvPicPr>
+                  <pic:blipFill>
+                    <a:blip r:embed="rId11"/>
+                    <a:stretch>
+                      <a:fillRect/>
+                    </a:stretch>
+                  </pic:blipFill>
+                  <pic:spPr>
+                    <a:xfrm>
+                      <a:off x="0" y="0"/>
+                      <a:ext cx="5731510" cy="2844165"/>
+                    </a:xfrm>
+                    <a:prstGeom prst="rect">
+                      <a:avLst/>
+                    </a:prstGeom>
+                  </pic:spPr>
+                </pic:pic>
+              </a:graphicData>
+            </a:graphic>
+          </wp:inline>
+        </w:drawing>
+      </w:r>
+    </w:p>
+    <w:p>
+      <w:r>
+        <w:drawing>
+          <wp:inline distT="0" distB="0" distL="0" distR="0" wp14:anchorId="3E604168" wp14:editId="07BFD710">
+            <wp:extent cx="5731510" cy="2367915"/>
+            <wp:effectExtent l="0" t="0" r="2540" b="0"/>
+            <wp:docPr id="1163562372" name="Picture 1"/>
+            <wp:cNvGraphicFramePr>
+              <a:graphicFrameLocks xmlns:a="http://schemas.openxmlformats.org/drawingml/2006/main" noChangeAspect="1"/>
+            </wp:cNvGraphicFramePr>
+            <a:graphic xmlns:a="http://schemas.openxmlformats.org/drawingml/2006/main">
+              <a:graphicData uri="http://schemas.openxmlformats.org/drawingml/2006/picture">
+                <pic:pic xmlns:pic="http://schemas.openxmlformats.org/drawingml/2006/picture">
+                  <pic:nvPicPr>
+                    <pic:cNvPr id="1163562372" name=""/>
+                    <pic:cNvPicPr/>
+                  </pic:nvPicPr>
+                  <pic:blipFill>
+                    <a:blip r:embed="rId12"/>
+                    <a:stretch>
+                      <a:fillRect/>
+                    </a:stretch>
+                  </pic:blipFill>
+                  <pic:spPr>
+                    <a:xfrm>
+                      <a:off x="0" y="0"/>
+                      <a:ext cx="5731510" cy="2367915"/>
+                    </a:xfrm>
+                    <a:prstGeom prst="rect">
+                      <a:avLst/>
+                    </a:prstGeom>
+                  </pic:spPr>
+                </pic:pic>
+              </a:graphicData>
+            </a:graphic>
+          </wp:inline>
+        </w:drawing>
+      </w:r>
+    </w:p>
+    <w:p>
+      <w:r>
+        <w:lastRenderedPageBreak/>
+        <w:drawing>
+          <wp:inline distT="0" distB="0" distL="0" distR="0" wp14:anchorId="047AE1E1" wp14:editId="57D144D4">
+            <wp:extent cx="5731510" cy="2637790"/>
+            <wp:effectExtent l="0" t="0" r="2540" b="0"/>
+            <wp:docPr id="1456221127" name="Picture 1"/>
+            <wp:cNvGraphicFramePr>
+              <a:graphicFrameLocks xmlns:a="http://schemas.openxmlformats.org/drawingml/2006/main" noChangeAspect="1"/>
+            </wp:cNvGraphicFramePr>
+            <a:graphic xmlns:a="http://schemas.openxmlformats.org/drawingml/2006/main">
+              <a:graphicData uri="http://schemas.openxmlformats.org/drawingml/2006/picture">
+                <pic:pic xmlns:pic="http://schemas.openxmlformats.org/drawingml/2006/picture">
+                  <pic:nvPicPr>
+                    <pic:cNvPr id="1456221127" name=""/>
+                    <pic:cNvPicPr/>
+                  </pic:nvPicPr>
+                  <pic:blipFill>
+                    <a:blip r:embed="rId13"/>
+                    <a:stretch>
+                      <a:fillRect/>
+                    </a:stretch>
+                  </pic:blipFill>
+                  <pic:spPr>
+                    <a:xfrm>
+                      <a:off x="0" y="0"/>
+                      <a:ext cx="5731510" cy="2637790"/>
+                    </a:xfrm>
+                    <a:prstGeom prst="rect">
+                      <a:avLst/>
+                    </a:prstGeom>
+                  </pic:spPr>
+                </pic:pic>
+              </a:graphicData>
+            </a:graphic>
+          </wp:inline>
+        </w:drawing>
+      </w:r>
+    </w:p>
+    <w:p>
+      <w:r>
+        <w:drawing>
+          <wp:inline distT="0" distB="0" distL="0" distR="0" wp14:anchorId="28106EB9" wp14:editId="6C856677">
+            <wp:extent cx="5731510" cy="2567940"/>
+            <wp:effectExtent l="0" t="0" r="2540" b="3810"/>
+            <wp:docPr id="206753784" name="Picture 1"/>
+            <wp:cNvGraphicFramePr>
+              <a:graphicFrameLocks xmlns:a="http://schemas.openxmlformats.org/drawingml/2006/main" noChangeAspect="1"/>
+            </wp:cNvGraphicFramePr>
+            <a:graphic xmlns:a="http://schemas.openxmlformats.org/drawingml/2006/main">
+              <a:graphicData uri="http://schemas.openxmlformats.org/drawingml/2006/picture">
+                <pic:pic xmlns:pic="http://schemas.openxmlformats.org/drawingml/2006/picture">
+                  <pic:nvPicPr>
+                    <pic:cNvPr id="206753784" name=""/>
+                    <pic:cNvPicPr/>
+                  </pic:nvPicPr>
+                  <pic:blipFill>
+                    <a:blip r:embed="rId14"/>
+                    <a:stretch>
+                      <a:fillRect/>
+                    </a:stretch>
+                  </pic:blipFill>
+                  <pic:spPr>
+                    <a:xfrm>
+                      <a:off x="0" y="0"/>
+                      <a:ext cx="5731510" cy="2567940"/>
+                    </a:xfrm>
+                    <a:prstGeom prst="rect">
+                      <a:avLst/>
+                    </a:prstGeom>
+                  </pic:spPr>
+                </pic:pic>
+              </a:graphicData>
+            </a:graphic>
+          </wp:inline>
+        </w:drawing>
+      </w:r>
+    </w:p>
+    <w:p>
+      <w:r>
+        <w:drawing>
+          <wp:inline distT="0" distB="0" distL="0" distR="0" wp14:anchorId="44011820" wp14:editId="3D34A2F1">
+            <wp:extent cx="5731510" cy="3089275"/>
+            <wp:effectExtent l="0" t="0" r="2540" b="0"/>
+            <wp:docPr id="1926208141" name="Picture 1"/>
+            <wp:cNvGraphicFramePr>
+              <a:graphicFrameLocks xmlns:a="http://schemas.openxmlformats.org/drawingml/2006/main" noChangeAspect="1"/>
+            </wp:cNvGraphicFramePr>
+            <a:graphic xmlns:a="http://schemas.openxmlformats.org/drawingml/2006/main">
+              <a:graphicData uri="http://schemas.openxmlformats.org/drawingml/2006/picture">
+                <pic:pic xmlns:pic="http://schemas.openxmlformats.org/drawingml/2006/picture">
+                  <pic:nvPicPr>
+                    <pic:cNvPr id="1926208141" name=""/>
+                    <pic:cNvPicPr/>
+                  </pic:nvPicPr>
+                  <pic:blipFill>
+                    <a:blip r:embed="rId15"/>
+                    <a:stretch>
+                      <a:fillRect/>
+                    </a:stretch>
+                  </pic:blipFill>
+                  <pic:spPr>
+                    <a:xfrm>
+                      <a:off x="0" y="0"/>
+                      <a:ext cx="5731510" cy="3089275"/>
+                    </a:xfrm>
+                    <a:prstGeom prst="rect">
+                      <a:avLst/>
+                    </a:prstGeom>
+                  </pic:spPr>
+                </pic:pic>
+              </a:graphicData>
+            </a:graphic>
+          </wp:inline>
+        </w:drawing>
+      </w:r>
+    </w:p>
+    <w:p>
+      <w:r>
+        <w:lastRenderedPageBreak/>
+        <w:drawing>
+          <wp:inline distT="0" distB="0" distL="0" distR="0" wp14:anchorId="155687F8" wp14:editId="10DE088F">
+            <wp:extent cx="5731510" cy="2921635"/>
+            <wp:effectExtent l="0" t="0" r="2540" b="0"/>
+            <wp:docPr id="1246750405" name="Picture 1"/>
+            <wp:cNvGraphicFramePr>
+              <a:graphicFrameLocks xmlns:a="http://schemas.openxmlformats.org/drawingml/2006/main" noChangeAspect="1"/>
+            </wp:cNvGraphicFramePr>
+            <a:graphic xmlns:a="http://schemas.openxmlformats.org/drawingml/2006/main">
+              <a:graphicData uri="http://schemas.openxmlformats.org/drawingml/2006/picture">
+                <pic:pic xmlns:pic="http://schemas.openxmlformats.org/drawingml/2006/picture">
+                  <pic:nvPicPr>
+                    <pic:cNvPr id="1246750405" name=""/>
+                    <pic:cNvPicPr/>
+                  </pic:nvPicPr>
+                  <pic:blipFill>
+                    <a:blip r:embed="rId16"/>
+                    <a:stretch>
+                      <a:fillRect/>
+                    </a:stretch>
+                  </pic:blipFill>
+                  <pic:spPr>
+                    <a:xfrm>
+                      <a:off x="0" y="0"/>
+                      <a:ext cx="5731510" cy="2921635"/>
+                    </a:xfrm>
+                    <a:prstGeom prst="rect">
+                      <a:avLst/>
+                    </a:prstGeom>
+                  </pic:spPr>
+                </pic:pic>
+              </a:graphicData>
+            </a:graphic>
+          </wp:inline>
+        </w:drawing>
+      </w:r>
+    </w:p>
+    <w:p>
+      <w:r>
+        <w:drawing>
+          <wp:inline distT="0" distB="0" distL="0" distR="0" wp14:anchorId="78A91C7B" wp14:editId="2849FC8D">
+            <wp:extent cx="5731510" cy="2637790"/>
+            <wp:effectExtent l="0" t="0" r="2540" b="0"/>
+            <wp:docPr id="345771149" name="Picture 1"/>
+            <wp:cNvGraphicFramePr>
+              <a:graphicFrameLocks xmlns:a="http://schemas.openxmlformats.org/drawingml/2006/main" noChangeAspect="1"/>
+            </wp:cNvGraphicFramePr>
+            <a:graphic xmlns:a="http://schemas.openxmlformats.org/drawingml/2006/main">
+              <a:graphicData uri="http://schemas.openxmlformats.org/drawingml/2006/picture">
+                <pic:pic xmlns:pic="http://schemas.openxmlformats.org/drawingml/2006/picture">
+                  <pic:nvPicPr>
+                    <pic:cNvPr id="345771149" name=""/>
+                    <pic:cNvPicPr/>
+                  </pic:nvPicPr>
+                  <pic:blipFill>
+                    <a:blip r:embed="rId17"/>
+                    <a:stretch>
+                      <a:fillRect/>
+                    </a:stretch>
+                  </pic:blipFill>
+                  <pic:spPr>
+                    <a:xfrm>
+                      <a:off x="0" y="0"/>
+                      <a:ext cx="5731510" cy="2637790"/>
+                    </a:xfrm>
+                    <a:prstGeom prst="rect">
+                      <a:avLst/>
+                    </a:prstGeom>
+                  </pic:spPr>
+                </pic:pic>
+              </a:graphicData>
+            </a:graphic>
+          </wp:inline>
+        </w:drawing>
+      </w:r>
+    </w:p>
+    <w:p>
+      <w:r>
+        <w:drawing>
+          <wp:inline distT="0" distB="0" distL="0" distR="0" wp14:anchorId="6249425E" wp14:editId="1BC916D3">
+            <wp:extent cx="5731510" cy="2366010"/>
+            <wp:effectExtent l="0" t="0" r="2540" b="0"/>
+            <wp:docPr id="1615266777" name="Picture 1"/>
+            <wp:cNvGraphicFramePr>
+              <a:graphicFrameLocks xmlns:a="http://schemas.openxmlformats.org/drawingml/2006/main" noChangeAspect="1"/>
+            </wp:cNvGraphicFramePr>
+            <a:graphic xmlns:a="http://schemas.openxmlformats.org/drawingml/2006/main">
+              <a:graphicData uri="http://schemas.openxmlformats.org/drawingml/2006/picture">
+                <pic:pic xmlns:pic="http://schemas.openxmlformats.org/drawingml/2006/picture">
+                  <pic:nvPicPr>
+                    <pic:cNvPr id="1615266777" name=""/>
+                    <pic:cNvPicPr/>
+                  </pic:nvPicPr>
+                  <pic:blipFill>
+                    <a:blip r:embed="rId18"/>
+                    <a:stretch>
+                      <a:fillRect/>
+                    </a:stretch>
+                  </pic:blipFill>
+                  <pic:spPr>
+                    <a:xfrm>
+                      <a:off x="0" y="0"/>
+                      <a:ext cx="5731510" cy="2366010"/>
+                    </a:xfrm>
+                    <a:prstGeom prst="rect">
+                      <a:avLst/>
+                    </a:prstGeom>
+                  </pic:spPr>
+                </pic:pic>
+              </a:graphicData>
+            </a:graphic>
+          </wp:inline>
+        </w:drawing>
+      </w:r>
+    </w:p>
+    <w:p>
+      <w:r>
+        <w:lastRenderedPageBreak/>
+        <w:drawing>
+          <wp:inline distT="0" distB="0" distL="0" distR="0" wp14:anchorId="11455FAC" wp14:editId="0B3E5860">
+            <wp:extent cx="5731510" cy="2498090"/>
+            <wp:effectExtent l="0" t="0" r="2540" b="0"/>
+            <wp:docPr id="1232815535" name="Picture 1"/>
+            <wp:cNvGraphicFramePr>
+              <a:graphicFrameLocks xmlns:a="http://schemas.openxmlformats.org/drawingml/2006/main" noChangeAspect="1"/>
+            </wp:cNvGraphicFramePr>
+            <a:graphic xmlns:a="http://schemas.openxmlformats.org/drawingml/2006/main">
+              <a:graphicData uri="http://schemas.openxmlformats.org/drawingml/2006/picture">
+                <pic:pic xmlns:pic="http://schemas.openxmlformats.org/drawingml/2006/picture">
+                  <pic:nvPicPr>
+                    <pic:cNvPr id="1232815535" name=""/>
+                    <pic:cNvPicPr/>
+                  </pic:nvPicPr>
+                  <pic:blipFill>
+                    <a:blip r:embed="rId19"/>
+                    <a:stretch>
+                      <a:fillRect/>
+                    </a:stretch>
+                  </pic:blipFill>
+                  <pic:spPr>
+                    <a:xfrm>
+                      <a:off x="0" y="0"/>
+                      <a:ext cx="5731510" cy="2498090"/>
+                    </a:xfrm>
+                    <a:prstGeom prst="rect">
+                      <a:avLst/>
+                    </a:prstGeom>
+                  </pic:spPr>
+                </pic:pic>
+              </a:graphicData>
+            </a:graphic>
+          </wp:inline>
+        </w:drawing>
+      </w:r>
+    </w:p>
+    <w:p>
+      <w:r>
+        <w:drawing>
+          <wp:inline distT="0" distB="0" distL="0" distR="0" wp14:anchorId="57371DE8" wp14:editId="7FABC965">
+            <wp:extent cx="5731510" cy="2728595"/>
+            <wp:effectExtent l="0" t="0" r="2540" b="0"/>
+            <wp:docPr id="1638904555" name="Picture 1"/>
+            <wp:cNvGraphicFramePr>
+              <a:graphicFrameLocks xmlns:a="http://schemas.openxmlformats.org/drawingml/2006/main" noChangeAspect="1"/>
+            </wp:cNvGraphicFramePr>
+            <a:graphic xmlns:a="http://schemas.openxmlformats.org/drawingml/2006/main">
+              <a:graphicData uri="http://schemas.openxmlformats.org/drawingml/2006/picture">
+                <pic:pic xmlns:pic="http://schemas.openxmlformats.org/drawingml/2006/picture">
+                  <pic:nvPicPr>
+                    <pic:cNvPr id="1638904555" name=""/>
+                    <pic:cNvPicPr/>
+                  </pic:nvPicPr>
+                  <pic:blipFill>
+                    <a:blip r:embed="rId20"/>
+                    <a:stretch>
+                      <a:fillRect/>
+                    </a:stretch>
+                  </pic:blipFill>
+                  <pic:spPr>
+                    <a:xfrm>
+                      <a:off x="0" y="0"/>
+                      <a:ext cx="5731510" cy="2728595"/>
+                    </a:xfrm>
+                    <a:prstGeom prst="rect">
+                      <a:avLst/>
+                    </a:prstGeom>
+                  </pic:spPr>
+                </pic:pic>
+              </a:graphicData>
+            </a:graphic>
+          </wp:inline>
+        </w:drawing>
+      </w:r>
+    </w:p>
+    <w:p>
+      <w:r>
+        <w:drawing>
+          <wp:inline distT="0" distB="0" distL="0" distR="0" wp14:anchorId="6C4C441A" wp14:editId="1BB46CBB">
+            <wp:extent cx="5731510" cy="2764155"/>
+            <wp:effectExtent l="0" t="0" r="2540" b="0"/>
+            <wp:docPr id="409546002" name="Picture 1"/>
+            <wp:cNvGraphicFramePr>
+              <a:graphicFrameLocks xmlns:a="http://schemas.openxmlformats.org/drawingml/2006/main" noChangeAspect="1"/>
+            </wp:cNvGraphicFramePr>
+            <a:graphic xmlns:a="http://schemas.openxmlformats.org/drawingml/2006/main">
+              <a:graphicData uri="http://schemas.openxmlformats.org/drawingml/2006/picture">
+                <pic:pic xmlns:pic="http://schemas.openxmlformats.org/drawingml/2006/picture">
+                  <pic:nvPicPr>
+                    <pic:cNvPr id="409546002" name=""/>
+                    <pic:cNvPicPr/>
+                  </pic:nvPicPr>
+                  <pic:blipFill>
+                    <a:blip r:embed="rId21"/>
+                    <a:stretch>
+                      <a:fillRect/>
+                    </a:stretch>
+                  </pic:blipFill>
+                  <pic:spPr>
+                    <a:xfrm>
+                      <a:off x="0" y="0"/>
+                      <a:ext cx="5731510" cy="2764155"/>
+                    </a:xfrm>
+                    <a:prstGeom prst="rect">
+                      <a:avLst/>
+                    </a:prstGeom>
+                  </pic:spPr>
+                </pic:pic>
+              </a:graphicData>
+            </a:graphic>
+          </wp:inline>
+        </w:drawing>
+      </w:r>
+    </w:p>
+    <w:p>
+      <w:r>
+        <w:lastRenderedPageBreak/>
+        <w:drawing>
+          <wp:inline distT="0" distB="0" distL="0" distR="0" wp14:anchorId="4527A56D" wp14:editId="63C0A212">
+            <wp:extent cx="5731510" cy="1200150"/>
+            <wp:effectExtent l="0" t="0" r="2540" b="0"/>
+            <wp:docPr id="834264301" name="Picture 1"/>
+            <wp:cNvGraphicFramePr>
+              <a:graphicFrameLocks xmlns:a="http://schemas.openxmlformats.org/drawingml/2006/main" noChangeAspect="1"/>
+            </wp:cNvGraphicFramePr>
+            <a:graphic xmlns:a="http://schemas.openxmlformats.org/drawingml/2006/main">
+              <a:graphicData uri="http://schemas.openxmlformats.org/drawingml/2006/picture">
+                <pic:pic xmlns:pic="http://schemas.openxmlformats.org/drawingml/2006/picture">
+                  <pic:nvPicPr>
+                    <pic:cNvPr id="834264301" name=""/>
+                    <pic:cNvPicPr/>
+                  </pic:nvPicPr>
+                  <pic:blipFill>
+                    <a:blip r:embed="rId22"/>
+                    <a:stretch>
+                      <a:fillRect/>
+                    </a:stretch>
+                  </pic:blipFill>
+                  <pic:spPr>
+                    <a:xfrm>
+                      <a:off x="0" y="0"/>
+                      <a:ext cx="5731510" cy="1200150"/>
+                    </a:xfrm>
+                    <a:prstGeom prst="rect">
+                      <a:avLst/>
+                    </a:prstGeom>
+                  </pic:spPr>
+                </pic:pic>
+              </a:graphicData>
+            </a:graphic>
+          </wp:inline>
+        </w:drawing>
+      </w:r>
+    </w:p>
+    <w:p/>
     <w:p/>
     <w:p/>
     <w:sectPr>

</xml_diff>